<commit_message>
Guide de la console : code court de la partie, téléchargement des QR et affiche A4 ; PROGRESS
Co-Authored-By: Claude Opus 5.5 <noreply@anthropic.com>
</commit_message>
<xml_diff>
--- a/docs/Greed Island - Guide de la console.docx
+++ b/docs/Greed Island - Guide de la console.docx
@@ -616,7 +616,7 @@
             </w:tcMar>
           </w:tcPr>
           <w:p>
-            <w:hyperlink w:history="1" r:id="rIdoag3nk2rdmj4j36lvomf5">
+            <w:hyperlink w:history="1" r:id="rIdwf_z8dypna33bfk_dkanq">
               <w:r>
                 <w:rPr>
                   <w:rStyle w:val="Hyperlink"/>
@@ -696,7 +696,7 @@
             </w:tcMar>
           </w:tcPr>
           <w:p>
-            <w:hyperlink w:history="1" r:id="rIdjzc10dm8ekhcghzkuf6fs">
+            <w:hyperlink w:history="1" r:id="rIdxaps6xy-a6bbhs7qzfu4z">
               <w:r>
                 <w:rPr>
                   <w:rStyle w:val="Hyperlink"/>
@@ -776,7 +776,7 @@
             </w:tcMar>
           </w:tcPr>
           <w:p>
-            <w:hyperlink w:history="1" r:id="rIdrhtq4tppanvaamayvvpv-">
+            <w:hyperlink w:history="1" r:id="rIdhgxd9afwwyvan5jvdrv8q">
               <w:r>
                 <w:rPr>
                   <w:rStyle w:val="Hyperlink"/>
@@ -856,7 +856,7 @@
             </w:tcMar>
           </w:tcPr>
           <w:p>
-            <w:hyperlink w:history="1" r:id="rIdkoi958ie9jv_cuanbvdix">
+            <w:hyperlink w:history="1" r:id="rIdo-t3f-a2kuzwfxvvswuke">
               <w:r>
                 <w:rPr>
                   <w:rStyle w:val="Hyperlink"/>
@@ -865,7 +865,7 @@
               </w:r>
             </w:hyperlink>
             <w:r>
-              <w:t xml:space="preserve">/?partie=&lt;identifiant de la partie&gt;</w:t>
+              <w:t xml:space="preserve">/?partie=&lt;code de la partie&gt;</w:t>
             </w:r>
           </w:p>
         </w:tc>
@@ -939,7 +939,7 @@
             </w:tcMar>
           </w:tcPr>
           <w:p>
-            <w:hyperlink w:history="1" r:id="rId-f7zacbipgnbyljon7pkj">
+            <w:hyperlink w:history="1" r:id="rIdeokjydz5gduqpiq2lf8yh">
               <w:r>
                 <w:rPr>
                   <w:rStyle w:val="Hyperlink"/>
@@ -1149,7 +1149,7 @@
             </w:tcMar>
           </w:tcPr>
           <w:p>
-            <w:hyperlink w:history="1" r:id="rIdpgof5jlqbbo3zj3wij20w">
+            <w:hyperlink w:history="1" r:id="rId5kcdv0olhlppo8k6kd4-x">
               <w:r>
                 <w:rPr>
                   <w:rStyle w:val="Hyperlink"/>
@@ -1229,7 +1229,7 @@
             </w:tcMar>
           </w:tcPr>
           <w:p>
-            <w:hyperlink w:history="1" r:id="rIdgjdf_9dff2r6qyi_k5dxg">
+            <w:hyperlink w:history="1" r:id="rIdwtc9zrcx6mhinvzaurnal">
               <w:r>
                 <w:rPr>
                   <w:rStyle w:val="Hyperlink"/>
@@ -1309,7 +1309,7 @@
             </w:tcMar>
           </w:tcPr>
           <w:p>
-            <w:hyperlink w:history="1" r:id="rId3jph-1k1cvhqhvtet7dlm">
+            <w:hyperlink w:history="1" r:id="rId2ndomoavoprsfbfyx95nr">
               <w:r>
                 <w:rPr>
                   <w:rStyle w:val="Hyperlink"/>
@@ -1389,7 +1389,7 @@
             </w:tcMar>
           </w:tcPr>
           <w:p>
-            <w:hyperlink w:history="1" r:id="rIddkihzcovw9a0s2begugh7">
+            <w:hyperlink w:history="1" r:id="rIdp675gnq3k4zfw6xhtdkke">
               <w:r>
                 <w:rPr>
                   <w:rStyle w:val="Hyperlink"/>
@@ -1459,7 +1459,7 @@
         <w:spacing w:after="120"/>
       </w:pPr>
       <w:r>
-        <w:t xml:space="preserve">La console sert à deux rôles. Chacun se connecte avec l’identifiant de la partie et son propre code.</w:t>
+        <w:t xml:space="preserve">La console sert à deux rôles. Chacun se connecte avec le code de la partie (6 caractères, ex. KX7P2M) et son propre code.</w:t>
       </w:r>
     </w:p>
     <w:tbl>
@@ -1774,7 +1774,7 @@
       <w:r>
         <w:t xml:space="preserve">Ouvre la console : </w:t>
       </w:r>
-      <w:hyperlink w:history="1" r:id="rIdol9k22jmaz0wqesyw3m6g">
+      <w:hyperlink w:history="1" r:id="rIdu_eeiweu1wsgrvrvcwb43">
         <w:r>
           <w:rPr>
             <w:rStyle w:val="Hyperlink"/>
@@ -1976,10 +1976,10 @@
           <w:b/>
           <w:bCs/>
         </w:rPr>
-        <w:t xml:space="preserve">Note l’identifiant de la partie. </w:t>
-      </w:r>
-      <w:r>
-        <w:t xml:space="preserve">Après la création, l’adresse de la console se termine par « ?partie=… ». Copie cette adresse entière : envoyée à un PNJ, elle remplit l’identifiant pour lui, il n’a plus qu’à taper son code. Le même identifiant sert pour l’écran géant.</w:t>
+        <w:t xml:space="preserve">Note le code de la partie. </w:t>
+      </w:r>
+      <w:r>
+        <w:t xml:space="preserve">Il s’affiche sur le Dashboard, dans « Ouvrir la console sur un téléphone » (6 caractères, ex. KX7P2M, sans O, 0, I ni 1), avec un QR : scanné avec l’appareil photo d’un téléphone, il ouvre la console sur la partie, il ne reste qu’à taper son code GM ou PNJ. Le même code sert aux joueurs (champ « Code de la partie ») et à l’écran géant.</w:t>
       </w:r>
     </w:p>
     <w:p>
@@ -2508,7 +2508,7 @@
       <w:r>
         <w:t xml:space="preserve">, mets : </w:t>
       </w:r>
-      <w:hyperlink w:history="1" r:id="rIdlnmdy0tib-qa-sdmpnae-">
+      <w:hyperlink w:history="1" r:id="rIdphhy1de4ginuble7aknnx">
         <w:r>
           <w:rPr>
             <w:rStyle w:val="Hyperlink"/>
@@ -2540,7 +2540,27 @@
         <w:t xml:space="preserve">« Rejoindre la partie »</w:t>
       </w:r>
       <w:r>
-        <w:t xml:space="preserve"> (inscription des joueurs). Impression 3 par ligne.</w:t>
+        <w:t xml:space="preserve"> (inscription des joueurs). Impression </w:t>
+      </w:r>
+      <w:r>
+        <w:rPr>
+          <w:b/>
+          <w:bCs/>
+        </w:rPr>
+        <w:t xml:space="preserve">3 par ligne</w:t>
+      </w:r>
+      <w:r>
+        <w:t xml:space="preserve"> ou </w:t>
+      </w:r>
+      <w:r>
+        <w:rPr>
+          <w:b/>
+          <w:bCs/>
+        </w:rPr>
+        <w:t xml:space="preserve">un QR par page (affiche A4)</w:t>
+      </w:r>
+      <w:r>
+        <w:t xml:space="preserve">.</w:t>
       </w:r>
     </w:p>
     <w:p>
@@ -2553,6 +2573,29 @@
         <w:spacing w:after="60"/>
       </w:pPr>
       <w:r>
+        <w:t xml:space="preserve">Sous chaque QR, le bouton </w:t>
+      </w:r>
+      <w:r>
+        <w:rPr>
+          <w:b/>
+          <w:bCs/>
+        </w:rPr>
+        <w:t xml:space="preserve">Télécharger</w:t>
+      </w:r>
+      <w:r>
+        <w:t xml:space="preserve"> enregistre son étiquette en image (PNG) : à envoyer à un imprimeur ou à imprimer à part.</w:t>
+      </w:r>
+    </w:p>
+    <w:p>
+      <w:pPr>
+        <w:pStyle w:val="ListParagraph"/>
+        <w:numPr>
+          <w:ilvl w:val="0"/>
+          <w:numId w:val="3"/>
+        </w:numPr>
+        <w:spacing w:after="60"/>
+      </w:pPr>
+      <w:r>
         <w:t xml:space="preserve">Sous chaque QR, un repère (ex. « B07 · Forêt ») aide à poser la balise au bon endroit : découpe-le ou plie-le au dos pour que les joueurs ne le voient pas.</w:t>
       </w:r>
     </w:p>
@@ -2605,7 +2648,7 @@
       <w:r>
         <w:t xml:space="preserve"> : ouvre </w:t>
       </w:r>
-      <w:hyperlink w:history="1" r:id="rIdq3rru-ujhxhonan9thvxe">
+      <w:hyperlink w:history="1" r:id="rIdyepkzrwbd1auq5p-yplot">
         <w:r>
           <w:rPr>
             <w:rStyle w:val="Hyperlink"/>
@@ -2647,7 +2690,7 @@
           <w:b/>
           <w:bCs/>
         </w:rPr>
-        <w:t xml:space="preserve">https://greed-island-ecran.jarvismboummeu28.workers.dev/?partie=&lt;identifiant&gt;</w:t>
+        <w:t xml:space="preserve">https://greed-island-ecran.jarvismboummeu28.workers.dev/?partie=&lt;code de la partie&gt;</w:t>
       </w:r>
       <w:r>
         <w:t xml:space="preserve">. Clique sur </w:t>
@@ -2692,7 +2735,7 @@
       <w:r>
         <w:t xml:space="preserve">. Les joueurs scannent le QR « Rejoindre la partie » ou ouvrent </w:t>
       </w:r>
-      <w:hyperlink w:history="1" r:id="rIdhzers9kqapbzaokjya1s7">
+      <w:hyperlink w:history="1" r:id="rIddqwnlhzskiokoiphwflex">
         <w:r>
           <w:rPr>
             <w:rStyle w:val="Hyperlink"/>

</xml_diff>

<commit_message>
Reprendre le terrain d'une partie précédente : zones et balises recopiées avec les mêmes QR (code GM de l'ancienne partie demandé) ; balises uniques par partie
Co-Authored-By: Claude Opus 5.5 <noreply@anthropic.com>
Claude-Session: https://claude.ai/code/session_01YNSX17zAwxLRYfSqtNYP8G
</commit_message>
<xml_diff>
--- a/docs/Greed Island - Guide de la console.docx
+++ b/docs/Greed Island - Guide de la console.docx
@@ -616,7 +616,7 @@
             </w:tcMar>
           </w:tcPr>
           <w:p>
-            <w:hyperlink w:history="1" r:id="rIdwf_z8dypna33bfk_dkanq">
+            <w:hyperlink w:history="1" r:id="rIdp1fv1p8cfkelozra3ne_h">
               <w:r>
                 <w:rPr>
                   <w:rStyle w:val="Hyperlink"/>
@@ -696,7 +696,7 @@
             </w:tcMar>
           </w:tcPr>
           <w:p>
-            <w:hyperlink w:history="1" r:id="rIdxaps6xy-a6bbhs7qzfu4z">
+            <w:hyperlink w:history="1" r:id="rIdhqgeso5cgbv3lkn-icryn">
               <w:r>
                 <w:rPr>
                   <w:rStyle w:val="Hyperlink"/>
@@ -776,7 +776,7 @@
             </w:tcMar>
           </w:tcPr>
           <w:p>
-            <w:hyperlink w:history="1" r:id="rIdhgxd9afwwyvan5jvdrv8q">
+            <w:hyperlink w:history="1" r:id="rId30hrmernro_xr6cic5pdy">
               <w:r>
                 <w:rPr>
                   <w:rStyle w:val="Hyperlink"/>
@@ -856,7 +856,7 @@
             </w:tcMar>
           </w:tcPr>
           <w:p>
-            <w:hyperlink w:history="1" r:id="rIdo-t3f-a2kuzwfxvvswuke">
+            <w:hyperlink w:history="1" r:id="rIdh83qeyktqidoo6_lg2kcd">
               <w:r>
                 <w:rPr>
                   <w:rStyle w:val="Hyperlink"/>
@@ -939,7 +939,7 @@
             </w:tcMar>
           </w:tcPr>
           <w:p>
-            <w:hyperlink w:history="1" r:id="rIdeokjydz5gduqpiq2lf8yh">
+            <w:hyperlink w:history="1" r:id="rIduvfkva85wzjl4mvattyn7">
               <w:r>
                 <w:rPr>
                   <w:rStyle w:val="Hyperlink"/>
@@ -1149,7 +1149,7 @@
             </w:tcMar>
           </w:tcPr>
           <w:p>
-            <w:hyperlink w:history="1" r:id="rId5kcdv0olhlppo8k6kd4-x">
+            <w:hyperlink w:history="1" r:id="rIdxetgnzp_4cfowjbo0i4z-">
               <w:r>
                 <w:rPr>
                   <w:rStyle w:val="Hyperlink"/>
@@ -1229,7 +1229,7 @@
             </w:tcMar>
           </w:tcPr>
           <w:p>
-            <w:hyperlink w:history="1" r:id="rIdwtc9zrcx6mhinvzaurnal">
+            <w:hyperlink w:history="1" r:id="rIddurbibionl7mb2i3zcrv5">
               <w:r>
                 <w:rPr>
                   <w:rStyle w:val="Hyperlink"/>
@@ -1309,7 +1309,7 @@
             </w:tcMar>
           </w:tcPr>
           <w:p>
-            <w:hyperlink w:history="1" r:id="rId2ndomoavoprsfbfyx95nr">
+            <w:hyperlink w:history="1" r:id="rIdjl751prali7wbwngz3u2m">
               <w:r>
                 <w:rPr>
                   <w:rStyle w:val="Hyperlink"/>
@@ -1389,7 +1389,7 @@
             </w:tcMar>
           </w:tcPr>
           <w:p>
-            <w:hyperlink w:history="1" r:id="rIdp675gnq3k4zfw6xhtdkke">
+            <w:hyperlink w:history="1" r:id="rIdcwnvx3of2evocm2p44tod">
               <w:r>
                 <w:rPr>
                   <w:rStyle w:val="Hyperlink"/>
@@ -1774,7 +1774,7 @@
       <w:r>
         <w:t xml:space="preserve">Ouvre la console : </w:t>
       </w:r>
-      <w:hyperlink w:history="1" r:id="rIdu_eeiweu1wsgrvrvcwb43">
+      <w:hyperlink w:history="1" r:id="rIdjxdgx23g-__bfdtdb028t">
         <w:r>
           <w:rPr>
             <w:rStyle w:val="Hyperlink"/>
@@ -2478,6 +2478,26 @@
     </w:p>
     <w:p>
       <w:pPr>
+        <w:pBdr>
+          <w:left w:val="single" w:color="B8860B" w:sz="18" w:space="8"/>
+        </w:pBdr>
+        <w:shd w:fill="FFF6DD" w:color="auto" w:val="clear"/>
+        <w:spacing w:after="160" w:before="120"/>
+        <w:ind w:left="200" w:right="200"/>
+      </w:pPr>
+      <w:r>
+        <w:rPr>
+          <w:b/>
+          <w:bCs/>
+        </w:rPr>
+        <w:t xml:space="preserve">Réutiliser les QR déjà posés. </w:t>
+      </w:r>
+      <w:r>
+        <w:t xml:space="preserve">Dans une partie neuve, Préparation → Zones → « Reprendre le terrain d’une partie précédente » : code de l’ancienne partie et son code GM. Zones et balises sont recopiées avec les mêmes QR (balises endormies, à réactiver). Pratique pour les essais ; pour une partie avec public, des QR neufs sont plus sûrs.</w:t>
+      </w:r>
+    </w:p>
+    <w:p>
+      <w:pPr>
         <w:pStyle w:val="Heading2"/>
       </w:pPr>
       <w:bookmarkStart w:name="t13" w:id="13"/>
@@ -2508,7 +2528,7 @@
       <w:r>
         <w:t xml:space="preserve">, mets : </w:t>
       </w:r>
-      <w:hyperlink w:history="1" r:id="rIdphhy1de4ginuble7aknnx">
+      <w:hyperlink w:history="1" r:id="rId5erfh4bsca43kvii0rskh">
         <w:r>
           <w:rPr>
             <w:rStyle w:val="Hyperlink"/>
@@ -2648,7 +2668,7 @@
       <w:r>
         <w:t xml:space="preserve"> : ouvre </w:t>
       </w:r>
-      <w:hyperlink w:history="1" r:id="rIdyepkzrwbd1auq5p-yplot">
+      <w:hyperlink w:history="1" r:id="rIdvrqnsti_tr80donhbzzsj">
         <w:r>
           <w:rPr>
             <w:rStyle w:val="Hyperlink"/>
@@ -2735,7 +2755,7 @@
       <w:r>
         <w:t xml:space="preserve">. Les joueurs scannent le QR « Rejoindre la partie » ou ouvrent </w:t>
       </w:r>
-      <w:hyperlink w:history="1" r:id="rIddqwnlhzskiokoiphwflex">
+      <w:hyperlink w:history="1" r:id="rIdw418tfneai-msif8kxpyw">
         <w:r>
           <w:rPr>
             <w:rStyle w:val="Hyperlink"/>

</xml_diff>